<commit_message>
feat(skills): T15 nexoura-output-formatting branded HTML+docx
</commit_message>
<xml_diff>
--- a/proprietary-skills/nexoura/output-formatting/reference.docx
+++ b/proprietary-skills/nexoura/output-formatting/reference.docx
@@ -539,6 +539,7 @@
       <w:jc w:val="center"/>
     </w:pPr>
     <w:rPr>
+      <w:color w:val="5B30FF"/>
       <w:rFonts w:asciiTheme="majorHAnsi" w:eastAsiaTheme="majorEastAsia" w:hAnsiTheme="majorHAnsi" w:cstheme="majorBidi"/>
       <w:sz w:val="56"/>
       <w:szCs w:val="56"/>
@@ -570,6 +571,7 @@
       </w:numPr>
     </w:pPr>
     <w:rPr>
+      <w:color w:val="7861FF"/>
       <w:rFonts w:eastAsiaTheme="majorEastAsia" w:cstheme="majorBidi"/>
       <w:spacing w:val="15"/>
       <w:sz w:val="28"/>
@@ -674,7 +676,7 @@
     </w:pPr>
     <w:rPr>
       <w:rFonts w:asciiTheme="majorHAnsi" w:eastAsiaTheme="majorEastAsia" w:hAnsiTheme="majorHAnsi" w:cstheme="majorBidi"/>
-      <w:color w:val="0F4761" w:themeColor="accent1" w:themeShade="BF"/>
+      <w:color w:val="5B30FF"/>
       <w:sz w:val="40"/>
       <w:szCs w:val="40"/>
     </w:rPr>
@@ -697,7 +699,7 @@
     </w:pPr>
     <w:rPr>
       <w:rFonts w:asciiTheme="majorHAnsi" w:eastAsiaTheme="majorEastAsia" w:hAnsiTheme="majorHAnsi" w:cstheme="majorBidi"/>
-      <w:color w:val="0F4761" w:themeColor="accent1" w:themeShade="BF"/>
+      <w:color w:val="7861FF"/>
       <w:sz w:val="32"/>
       <w:szCs w:val="32"/>
     </w:rPr>
@@ -720,7 +722,7 @@
     </w:pPr>
     <w:rPr>
       <w:rFonts w:eastAsiaTheme="majorEastAsia" w:cstheme="majorBidi"/>
-      <w:color w:val="0F4761" w:themeColor="accent1" w:themeShade="BF"/>
+      <w:color w:val="2563FF"/>
       <w:sz w:val="28"/>
       <w:szCs w:val="28"/>
     </w:rPr>
@@ -745,7 +747,7 @@
       <w:rFonts w:eastAsiaTheme="majorEastAsia" w:cstheme="majorBidi"/>
       <w:i/>
       <w:iCs/>
-      <w:color w:val="0F4761" w:themeColor="accent1" w:themeShade="BF"/>
+      <w:color w:val="475569"/>
     </w:rPr>
   </w:style>
   <w:style w:type="paragraph" w:styleId="Heading5">

</xml_diff>

<commit_message>
feat(skills): T15 polish — Sora font, gradient footer, status pills
Closes 3 TODOs from #29:
- Sora Regular 400 TTF embedded in reference.docx via OOXML (word/fonts/sora.ttf + fontTable.xml).
- 600x60 gradient footer-tagline.png generated deterministically, wired via word/footer1.xml and embedded as base64 data URL in HTML template.
- 9 NEXOURAPill* character styles (Verified/Resolved/Blocked/Warning/P0-P4) defined in styles.xml; render.py post-processes document.xml to wrap markers.

Sample re-rendered. Verification (unzip -l + style grep) confirms all three landed. Honest caveats documented in SKILL.md §3: TTF un-obfuscated (no w:fontKey), pills flat in DOCX (w:shd has no rounded corners), no LibreOffice in env so visual verification deferred to recipient.
</commit_message>
<xml_diff>
--- a/proprietary-skills/nexoura/output-formatting/reference.docx
+++ b/proprietary-skills/nexoura/output-formatting/reference.docx
@@ -314,6 +314,7 @@
       </w:r>
     </w:p>
     <w:sectPr>
+      <w:footerReference w:type="default" r:id="rIdFooter1"/>
       <w:footnotePr>
         <w:numRestart w:val="eachSect"/>
       </w:footnotePr>
@@ -324,6 +325,56 @@
 
 <file path=word/comments.xml><?xml version="1.0" encoding="utf-8"?>
 <w:comments xmlns:w="http://schemas.openxmlformats.org/wordprocessingml/2006/main" xmlns:m="http://schemas.openxmlformats.org/officeDocument/2006/math" xmlns:r="http://schemas.openxmlformats.org/officeDocument/2006/relationships" xmlns:o="urn:schemas-microsoft-com:office:office" xmlns:v="urn:schemas-microsoft-com:vml" xmlns:w10="urn:schemas-microsoft-com:office:word" xmlns:a="http://schemas.openxmlformats.org/drawingml/2006/main" xmlns:pic="http://schemas.openxmlformats.org/drawingml/2006/picture" xmlns:wp="http://schemas.openxmlformats.org/drawingml/2006/wordprocessingDrawing"/>
+</file>
+
+<file path=word/footer1.xml><?xml version="1.0" encoding="utf-8"?>
+<w:ftr xmlns:w="http://schemas.openxmlformats.org/wordprocessingml/2006/main" xmlns:r="http://schemas.openxmlformats.org/officeDocument/2006/relationships" xmlns:wp="http://schemas.openxmlformats.org/drawingml/2006/wordprocessingDrawing" xmlns:a="http://schemas.openxmlformats.org/drawingml/2006/main" xmlns:pic="http://schemas.openxmlformats.org/drawingml/2006/picture">
+  <w:p>
+    <w:pPr>
+      <w:jc w:val="center"/>
+    </w:pPr>
+    <w:r>
+      <w:rPr>
+        <w:noProof/>
+      </w:rPr>
+      <w:drawing>
+        <wp:inline distT="0" distB="0" distL="0" distR="0">
+          <wp:extent cx="3810000" cy="381000"/>
+          <wp:effectExtent l="0" t="0" r="0" b="0"/>
+          <wp:docPr id="1" name="FooterTagline" descr="NEXOURA WHERE AI BUILDS"/>
+          <wp:cNvGraphicFramePr>
+            <a:graphicFrameLocks noChangeAspect="1"/>
+          </wp:cNvGraphicFramePr>
+          <a:graphic>
+            <a:graphicData uri="http://schemas.openxmlformats.org/drawingml/2006/picture">
+              <pic:pic>
+                <pic:nvPicPr>
+                  <pic:cNvPr id="1" name="FooterTagline"/>
+                  <pic:cNvPicPr/>
+                </pic:nvPicPr>
+                <pic:blipFill>
+                  <a:blip r:embed="rIdFooterImg"/>
+                  <a:stretch>
+                    <a:fillRect/>
+                  </a:stretch>
+                </pic:blipFill>
+                <pic:spPr>
+                  <a:xfrm>
+                    <a:off x="0" y="0"/>
+                    <a:ext cx="3810000" cy="381000"/>
+                  </a:xfrm>
+                  <a:prstGeom prst="rect">
+                    <a:avLst/>
+                  </a:prstGeom>
+                </pic:spPr>
+              </pic:pic>
+            </a:graphicData>
+          </a:graphic>
+        </wp:inline>
+      </w:drawing>
+    </w:r>
+  </w:p>
+</w:ftr>
 </file>
 
 <file path=word/footnotes.xml><?xml version="1.0" encoding="utf-8"?>
@@ -501,6 +552,9 @@
   <w:style w:type="paragraph" w:default="1" w:styleId="Normal">
     <w:name w:val="Normal"/>
     <w:qFormat/>
+    <w:rPr>
+      <w:rFonts w:ascii="Sora" w:hAnsi="Sora" w:cs="Sora"/>
+    </w:rPr>
   </w:style>
   <w:style w:type="paragraph" w:styleId="BodyText">
     <w:name w:val="Body Text"/>
@@ -540,7 +594,7 @@
     </w:pPr>
     <w:rPr>
       <w:color w:val="5B30FF"/>
-      <w:rFonts w:asciiTheme="majorHAnsi" w:eastAsiaTheme="majorEastAsia" w:hAnsiTheme="majorHAnsi" w:cstheme="majorBidi"/>
+      <w:rFonts w:ascii="Sora" w:hAnsi="Sora" w:cs="Sora"/>
       <w:sz w:val="56"/>
       <w:szCs w:val="56"/>
     </w:rPr>
@@ -572,7 +626,7 @@
     </w:pPr>
     <w:rPr>
       <w:color w:val="7861FF"/>
-      <w:rFonts w:eastAsiaTheme="majorEastAsia" w:cstheme="majorBidi"/>
+      <w:rFonts w:ascii="Sora" w:hAnsi="Sora" w:cs="Sora"/>
       <w:spacing w:val="15"/>
       <w:sz w:val="28"/>
       <w:szCs w:val="28"/>
@@ -675,7 +729,7 @@
       <w:outlineLvl w:val="0"/>
     </w:pPr>
     <w:rPr>
-      <w:rFonts w:asciiTheme="majorHAnsi" w:eastAsiaTheme="majorEastAsia" w:hAnsiTheme="majorHAnsi" w:cstheme="majorBidi"/>
+      <w:rFonts w:ascii="Sora" w:hAnsi="Sora" w:cs="Sora"/>
       <w:color w:val="5B30FF"/>
       <w:sz w:val="40"/>
       <w:szCs w:val="40"/>
@@ -698,7 +752,7 @@
       <w:outlineLvl w:val="1"/>
     </w:pPr>
     <w:rPr>
-      <w:rFonts w:asciiTheme="majorHAnsi" w:eastAsiaTheme="majorEastAsia" w:hAnsiTheme="majorHAnsi" w:cstheme="majorBidi"/>
+      <w:rFonts w:ascii="Sora" w:hAnsi="Sora" w:cs="Sora"/>
       <w:color w:val="7861FF"/>
       <w:sz w:val="32"/>
       <w:szCs w:val="32"/>
@@ -721,7 +775,7 @@
       <w:outlineLvl w:val="2"/>
     </w:pPr>
     <w:rPr>
-      <w:rFonts w:eastAsiaTheme="majorEastAsia" w:cstheme="majorBidi"/>
+      <w:rFonts w:ascii="Sora" w:hAnsi="Sora" w:cs="Sora"/>
       <w:color w:val="2563FF"/>
       <w:sz w:val="28"/>
       <w:szCs w:val="28"/>
@@ -744,7 +798,7 @@
       <w:outlineLvl w:val="3"/>
     </w:pPr>
     <w:rPr>
-      <w:rFonts w:eastAsiaTheme="majorEastAsia" w:cstheme="majorBidi"/>
+      <w:rFonts w:ascii="Sora" w:hAnsi="Sora" w:cs="Sora"/>
       <w:i/>
       <w:iCs/>
       <w:color w:val="475569"/>
@@ -1143,6 +1197,105 @@
       <w:b w:val="0"/>
       <w:bCs w:val="0"/>
       <w:color w:val="365F91" w:themeColor="accent1" w:themeShade="BF"/>
+    </w:rPr>
+  </w:style>
+  <w:style w:type="character" w:customStyle="1" w:styleId="NEXOURAPillVerified">
+    <w:name w:val="NEXOURA Pill Verified"/>
+    <w:rPr>
+      <w:rFonts w:ascii="Sora" w:hAnsi="Sora" w:cs="Sora"/>
+      <w:b/>
+      <w:caps/>
+      <w:color w:val="FFFFFF"/>
+      <w:sz w:val="22"/>
+      <w:shd w:val="clear" w:color="auto" w:fill="00E0FF"/>
+    </w:rPr>
+  </w:style>
+  <w:style w:type="character" w:customStyle="1" w:styleId="NEXOURAPillResolved">
+    <w:name w:val="NEXOURA Pill Resolved"/>
+    <w:rPr>
+      <w:rFonts w:ascii="Sora" w:hAnsi="Sora" w:cs="Sora"/>
+      <w:b/>
+      <w:caps/>
+      <w:color w:val="FFFFFF"/>
+      <w:sz w:val="22"/>
+      <w:shd w:val="clear" w:color="auto" w:fill="2563FF"/>
+    </w:rPr>
+  </w:style>
+  <w:style w:type="character" w:customStyle="1" w:styleId="NEXOURAPillBlocked">
+    <w:name w:val="NEXOURA Pill Blocked"/>
+    <w:rPr>
+      <w:rFonts w:ascii="Sora" w:hAnsi="Sora" w:cs="Sora"/>
+      <w:b/>
+      <w:caps/>
+      <w:color w:val="FFFFFF"/>
+      <w:sz w:val="22"/>
+      <w:shd w:val="clear" w:color="auto" w:fill="7861FF"/>
+    </w:rPr>
+  </w:style>
+  <w:style w:type="character" w:customStyle="1" w:styleId="NEXOURAPillWarning">
+    <w:name w:val="NEXOURA Pill Warning"/>
+    <w:rPr>
+      <w:rFonts w:ascii="Sora" w:hAnsi="Sora" w:cs="Sora"/>
+      <w:b/>
+      <w:caps/>
+      <w:color w:val="FFFFFF"/>
+      <w:sz w:val="22"/>
+      <w:shd w:val="clear" w:color="auto" w:fill="F59E0B"/>
+    </w:rPr>
+  </w:style>
+  <w:style w:type="character" w:customStyle="1" w:styleId="NEXOURAPillP0">
+    <w:name w:val="NEXOURA Pill P0"/>
+    <w:rPr>
+      <w:rFonts w:ascii="Sora" w:hAnsi="Sora" w:cs="Sora"/>
+      <w:b/>
+      <w:caps/>
+      <w:color w:val="FFFFFF"/>
+      <w:sz w:val="22"/>
+      <w:shd w:val="clear" w:color="auto" w:fill="DC2626"/>
+    </w:rPr>
+  </w:style>
+  <w:style w:type="character" w:customStyle="1" w:styleId="NEXOURAPillP1">
+    <w:name w:val="NEXOURA Pill P1"/>
+    <w:rPr>
+      <w:rFonts w:ascii="Sora" w:hAnsi="Sora" w:cs="Sora"/>
+      <w:b/>
+      <w:caps/>
+      <w:color w:val="FFFFFF"/>
+      <w:sz w:val="22"/>
+      <w:shd w:val="clear" w:color="auto" w:fill="2563FF"/>
+    </w:rPr>
+  </w:style>
+  <w:style w:type="character" w:customStyle="1" w:styleId="NEXOURAPillP2">
+    <w:name w:val="NEXOURA Pill P2"/>
+    <w:rPr>
+      <w:rFonts w:ascii="Sora" w:hAnsi="Sora" w:cs="Sora"/>
+      <w:b/>
+      <w:caps/>
+      <w:color w:val="FFFFFF"/>
+      <w:sz w:val="22"/>
+      <w:shd w:val="clear" w:color="auto" w:fill="F59E0B"/>
+    </w:rPr>
+  </w:style>
+  <w:style w:type="character" w:customStyle="1" w:styleId="NEXOURAPillP3">
+    <w:name w:val="NEXOURA Pill P3"/>
+    <w:rPr>
+      <w:rFonts w:ascii="Sora" w:hAnsi="Sora" w:cs="Sora"/>
+      <w:b/>
+      <w:caps/>
+      <w:color w:val="FFFFFF"/>
+      <w:sz w:val="22"/>
+      <w:shd w:val="clear" w:color="auto" w:fill="6B7280"/>
+    </w:rPr>
+  </w:style>
+  <w:style w:type="character" w:customStyle="1" w:styleId="NEXOURAPillP4">
+    <w:name w:val="NEXOURA Pill P4"/>
+    <w:rPr>
+      <w:rFonts w:ascii="Sora" w:hAnsi="Sora" w:cs="Sora"/>
+      <w:b/>
+      <w:caps/>
+      <w:color w:val="FFFFFF"/>
+      <w:sz w:val="22"/>
+      <w:shd w:val="clear" w:color="auto" w:fill="6B7280"/>
     </w:rPr>
   </w:style>
 </w:styles>

</xml_diff>

<commit_message>
feat(skills): T15 polish — Sora font, gradient footer, status pills (#39)
* feat(skills): T15 polish — Sora font, gradient footer, status pills

Closes 3 TODOs from #29:
- Sora Regular 400 TTF embedded in reference.docx via OOXML (word/fonts/sora.ttf + fontTable.xml).
- 600x60 gradient footer-tagline.png generated deterministically, wired via word/footer1.xml and embedded as base64 data URL in HTML template.
- 9 NEXOURAPill* character styles (Verified/Resolved/Blocked/Warning/P0-P4) defined in styles.xml; render.py post-processes document.xml to wrap markers.

Sample re-rendered. Verification (unzip -l + style grep) confirms all three landed. Honest caveats documented in SKILL.md §3: TTF un-obfuscated (no w:fontKey), pills flat in DOCX (w:shd has no rounded corners), no LibreOffice in env so visual verification deferred to recipient.

* chore(t15): drop accidentally-committed pandoc-default backup; gitignore
</commit_message>
<xml_diff>
--- a/proprietary-skills/nexoura/output-formatting/reference.docx
+++ b/proprietary-skills/nexoura/output-formatting/reference.docx
@@ -314,6 +314,7 @@
       </w:r>
     </w:p>
     <w:sectPr>
+      <w:footerReference w:type="default" r:id="rIdFooter1"/>
       <w:footnotePr>
         <w:numRestart w:val="eachSect"/>
       </w:footnotePr>
@@ -324,6 +325,56 @@
 
 <file path=word/comments.xml><?xml version="1.0" encoding="utf-8"?>
 <w:comments xmlns:w="http://schemas.openxmlformats.org/wordprocessingml/2006/main" xmlns:m="http://schemas.openxmlformats.org/officeDocument/2006/math" xmlns:r="http://schemas.openxmlformats.org/officeDocument/2006/relationships" xmlns:o="urn:schemas-microsoft-com:office:office" xmlns:v="urn:schemas-microsoft-com:vml" xmlns:w10="urn:schemas-microsoft-com:office:word" xmlns:a="http://schemas.openxmlformats.org/drawingml/2006/main" xmlns:pic="http://schemas.openxmlformats.org/drawingml/2006/picture" xmlns:wp="http://schemas.openxmlformats.org/drawingml/2006/wordprocessingDrawing"/>
+</file>
+
+<file path=word/footer1.xml><?xml version="1.0" encoding="utf-8"?>
+<w:ftr xmlns:w="http://schemas.openxmlformats.org/wordprocessingml/2006/main" xmlns:r="http://schemas.openxmlformats.org/officeDocument/2006/relationships" xmlns:wp="http://schemas.openxmlformats.org/drawingml/2006/wordprocessingDrawing" xmlns:a="http://schemas.openxmlformats.org/drawingml/2006/main" xmlns:pic="http://schemas.openxmlformats.org/drawingml/2006/picture">
+  <w:p>
+    <w:pPr>
+      <w:jc w:val="center"/>
+    </w:pPr>
+    <w:r>
+      <w:rPr>
+        <w:noProof/>
+      </w:rPr>
+      <w:drawing>
+        <wp:inline distT="0" distB="0" distL="0" distR="0">
+          <wp:extent cx="3810000" cy="381000"/>
+          <wp:effectExtent l="0" t="0" r="0" b="0"/>
+          <wp:docPr id="1" name="FooterTagline" descr="NEXOURA WHERE AI BUILDS"/>
+          <wp:cNvGraphicFramePr>
+            <a:graphicFrameLocks noChangeAspect="1"/>
+          </wp:cNvGraphicFramePr>
+          <a:graphic>
+            <a:graphicData uri="http://schemas.openxmlformats.org/drawingml/2006/picture">
+              <pic:pic>
+                <pic:nvPicPr>
+                  <pic:cNvPr id="1" name="FooterTagline"/>
+                  <pic:cNvPicPr/>
+                </pic:nvPicPr>
+                <pic:blipFill>
+                  <a:blip r:embed="rIdFooterImg"/>
+                  <a:stretch>
+                    <a:fillRect/>
+                  </a:stretch>
+                </pic:blipFill>
+                <pic:spPr>
+                  <a:xfrm>
+                    <a:off x="0" y="0"/>
+                    <a:ext cx="3810000" cy="381000"/>
+                  </a:xfrm>
+                  <a:prstGeom prst="rect">
+                    <a:avLst/>
+                  </a:prstGeom>
+                </pic:spPr>
+              </pic:pic>
+            </a:graphicData>
+          </a:graphic>
+        </wp:inline>
+      </w:drawing>
+    </w:r>
+  </w:p>
+</w:ftr>
 </file>
 
 <file path=word/footnotes.xml><?xml version="1.0" encoding="utf-8"?>
@@ -501,6 +552,9 @@
   <w:style w:type="paragraph" w:default="1" w:styleId="Normal">
     <w:name w:val="Normal"/>
     <w:qFormat/>
+    <w:rPr>
+      <w:rFonts w:ascii="Sora" w:hAnsi="Sora" w:cs="Sora"/>
+    </w:rPr>
   </w:style>
   <w:style w:type="paragraph" w:styleId="BodyText">
     <w:name w:val="Body Text"/>
@@ -540,7 +594,7 @@
     </w:pPr>
     <w:rPr>
       <w:color w:val="5B30FF"/>
-      <w:rFonts w:asciiTheme="majorHAnsi" w:eastAsiaTheme="majorEastAsia" w:hAnsiTheme="majorHAnsi" w:cstheme="majorBidi"/>
+      <w:rFonts w:ascii="Sora" w:hAnsi="Sora" w:cs="Sora"/>
       <w:sz w:val="56"/>
       <w:szCs w:val="56"/>
     </w:rPr>
@@ -572,7 +626,7 @@
     </w:pPr>
     <w:rPr>
       <w:color w:val="7861FF"/>
-      <w:rFonts w:eastAsiaTheme="majorEastAsia" w:cstheme="majorBidi"/>
+      <w:rFonts w:ascii="Sora" w:hAnsi="Sora" w:cs="Sora"/>
       <w:spacing w:val="15"/>
       <w:sz w:val="28"/>
       <w:szCs w:val="28"/>
@@ -675,7 +729,7 @@
       <w:outlineLvl w:val="0"/>
     </w:pPr>
     <w:rPr>
-      <w:rFonts w:asciiTheme="majorHAnsi" w:eastAsiaTheme="majorEastAsia" w:hAnsiTheme="majorHAnsi" w:cstheme="majorBidi"/>
+      <w:rFonts w:ascii="Sora" w:hAnsi="Sora" w:cs="Sora"/>
       <w:color w:val="5B30FF"/>
       <w:sz w:val="40"/>
       <w:szCs w:val="40"/>
@@ -698,7 +752,7 @@
       <w:outlineLvl w:val="1"/>
     </w:pPr>
     <w:rPr>
-      <w:rFonts w:asciiTheme="majorHAnsi" w:eastAsiaTheme="majorEastAsia" w:hAnsiTheme="majorHAnsi" w:cstheme="majorBidi"/>
+      <w:rFonts w:ascii="Sora" w:hAnsi="Sora" w:cs="Sora"/>
       <w:color w:val="7861FF"/>
       <w:sz w:val="32"/>
       <w:szCs w:val="32"/>
@@ -721,7 +775,7 @@
       <w:outlineLvl w:val="2"/>
     </w:pPr>
     <w:rPr>
-      <w:rFonts w:eastAsiaTheme="majorEastAsia" w:cstheme="majorBidi"/>
+      <w:rFonts w:ascii="Sora" w:hAnsi="Sora" w:cs="Sora"/>
       <w:color w:val="2563FF"/>
       <w:sz w:val="28"/>
       <w:szCs w:val="28"/>
@@ -744,7 +798,7 @@
       <w:outlineLvl w:val="3"/>
     </w:pPr>
     <w:rPr>
-      <w:rFonts w:eastAsiaTheme="majorEastAsia" w:cstheme="majorBidi"/>
+      <w:rFonts w:ascii="Sora" w:hAnsi="Sora" w:cs="Sora"/>
       <w:i/>
       <w:iCs/>
       <w:color w:val="475569"/>
@@ -1143,6 +1197,105 @@
       <w:b w:val="0"/>
       <w:bCs w:val="0"/>
       <w:color w:val="365F91" w:themeColor="accent1" w:themeShade="BF"/>
+    </w:rPr>
+  </w:style>
+  <w:style w:type="character" w:customStyle="1" w:styleId="NEXOURAPillVerified">
+    <w:name w:val="NEXOURA Pill Verified"/>
+    <w:rPr>
+      <w:rFonts w:ascii="Sora" w:hAnsi="Sora" w:cs="Sora"/>
+      <w:b/>
+      <w:caps/>
+      <w:color w:val="FFFFFF"/>
+      <w:sz w:val="22"/>
+      <w:shd w:val="clear" w:color="auto" w:fill="00E0FF"/>
+    </w:rPr>
+  </w:style>
+  <w:style w:type="character" w:customStyle="1" w:styleId="NEXOURAPillResolved">
+    <w:name w:val="NEXOURA Pill Resolved"/>
+    <w:rPr>
+      <w:rFonts w:ascii="Sora" w:hAnsi="Sora" w:cs="Sora"/>
+      <w:b/>
+      <w:caps/>
+      <w:color w:val="FFFFFF"/>
+      <w:sz w:val="22"/>
+      <w:shd w:val="clear" w:color="auto" w:fill="2563FF"/>
+    </w:rPr>
+  </w:style>
+  <w:style w:type="character" w:customStyle="1" w:styleId="NEXOURAPillBlocked">
+    <w:name w:val="NEXOURA Pill Blocked"/>
+    <w:rPr>
+      <w:rFonts w:ascii="Sora" w:hAnsi="Sora" w:cs="Sora"/>
+      <w:b/>
+      <w:caps/>
+      <w:color w:val="FFFFFF"/>
+      <w:sz w:val="22"/>
+      <w:shd w:val="clear" w:color="auto" w:fill="7861FF"/>
+    </w:rPr>
+  </w:style>
+  <w:style w:type="character" w:customStyle="1" w:styleId="NEXOURAPillWarning">
+    <w:name w:val="NEXOURA Pill Warning"/>
+    <w:rPr>
+      <w:rFonts w:ascii="Sora" w:hAnsi="Sora" w:cs="Sora"/>
+      <w:b/>
+      <w:caps/>
+      <w:color w:val="FFFFFF"/>
+      <w:sz w:val="22"/>
+      <w:shd w:val="clear" w:color="auto" w:fill="F59E0B"/>
+    </w:rPr>
+  </w:style>
+  <w:style w:type="character" w:customStyle="1" w:styleId="NEXOURAPillP0">
+    <w:name w:val="NEXOURA Pill P0"/>
+    <w:rPr>
+      <w:rFonts w:ascii="Sora" w:hAnsi="Sora" w:cs="Sora"/>
+      <w:b/>
+      <w:caps/>
+      <w:color w:val="FFFFFF"/>
+      <w:sz w:val="22"/>
+      <w:shd w:val="clear" w:color="auto" w:fill="DC2626"/>
+    </w:rPr>
+  </w:style>
+  <w:style w:type="character" w:customStyle="1" w:styleId="NEXOURAPillP1">
+    <w:name w:val="NEXOURA Pill P1"/>
+    <w:rPr>
+      <w:rFonts w:ascii="Sora" w:hAnsi="Sora" w:cs="Sora"/>
+      <w:b/>
+      <w:caps/>
+      <w:color w:val="FFFFFF"/>
+      <w:sz w:val="22"/>
+      <w:shd w:val="clear" w:color="auto" w:fill="2563FF"/>
+    </w:rPr>
+  </w:style>
+  <w:style w:type="character" w:customStyle="1" w:styleId="NEXOURAPillP2">
+    <w:name w:val="NEXOURA Pill P2"/>
+    <w:rPr>
+      <w:rFonts w:ascii="Sora" w:hAnsi="Sora" w:cs="Sora"/>
+      <w:b/>
+      <w:caps/>
+      <w:color w:val="FFFFFF"/>
+      <w:sz w:val="22"/>
+      <w:shd w:val="clear" w:color="auto" w:fill="F59E0B"/>
+    </w:rPr>
+  </w:style>
+  <w:style w:type="character" w:customStyle="1" w:styleId="NEXOURAPillP3">
+    <w:name w:val="NEXOURA Pill P3"/>
+    <w:rPr>
+      <w:rFonts w:ascii="Sora" w:hAnsi="Sora" w:cs="Sora"/>
+      <w:b/>
+      <w:caps/>
+      <w:color w:val="FFFFFF"/>
+      <w:sz w:val="22"/>
+      <w:shd w:val="clear" w:color="auto" w:fill="6B7280"/>
+    </w:rPr>
+  </w:style>
+  <w:style w:type="character" w:customStyle="1" w:styleId="NEXOURAPillP4">
+    <w:name w:val="NEXOURA Pill P4"/>
+    <w:rPr>
+      <w:rFonts w:ascii="Sora" w:hAnsi="Sora" w:cs="Sora"/>
+      <w:b/>
+      <w:caps/>
+      <w:color w:val="FFFFFF"/>
+      <w:sz w:val="22"/>
+      <w:shd w:val="clear" w:color="auto" w:fill="6B7280"/>
     </w:rPr>
   </w:style>
 </w:styles>

</xml_diff>